<commit_message>
Match Resume 2 spacing and education layout in AI/ML Systems resume
Co-Authored-By: Claude Opus 5.5 <noreply@anthropic.com>
Claude-Session: https://claude.ai/code/session_013uu8YLK93nR2ygpNvDWsMr
</commit_message>
<xml_diff>
--- a/resume/Ritesh_Somashekar_AI_ML_Systems_Engineer.docx
+++ b/resume/Ritesh_Somashekar_AI_ML_Systems_Engineer.docx
@@ -71,7 +71,7 @@
         <w:tabs>
           <w:tab w:pos="360" w:val="left"/>
         </w:tabs>
-        <w:spacing w:after="80"/>
+        <w:spacing w:line="276" w:lineRule="auto" w:after="60"/>
         <w:ind w:left="360" w:hanging="360"/>
       </w:pPr>
       <w:r>
@@ -196,7 +196,7 @@
         <w:tabs>
           <w:tab w:pos="360" w:val="left"/>
         </w:tabs>
-        <w:spacing w:after="80"/>
+        <w:spacing w:line="276" w:lineRule="auto" w:after="60"/>
         <w:ind w:left="360" w:hanging="360"/>
       </w:pPr>
       <w:r>
@@ -272,7 +272,7 @@
         <w:tabs>
           <w:tab w:pos="360" w:val="left"/>
         </w:tabs>
-        <w:spacing w:after="80"/>
+        <w:spacing w:line="276" w:lineRule="auto" w:after="60"/>
         <w:ind w:left="360" w:hanging="360"/>
       </w:pPr>
       <w:r>
@@ -374,7 +374,7 @@
     </w:p>
     <w:p>
       <w:pPr>
-        <w:spacing w:after="20"/>
+        <w:spacing w:after="40"/>
       </w:pPr>
       <w:r>
         <w:rPr>
@@ -393,7 +393,7 @@
     </w:p>
     <w:p>
       <w:pPr>
-        <w:spacing w:after="20"/>
+        <w:spacing w:after="40"/>
       </w:pPr>
       <w:r>
         <w:rPr>
@@ -412,7 +412,7 @@
     </w:p>
     <w:p>
       <w:pPr>
-        <w:spacing w:after="20"/>
+        <w:spacing w:after="40"/>
       </w:pPr>
       <w:r>
         <w:rPr>
@@ -431,7 +431,7 @@
     </w:p>
     <w:p>
       <w:pPr>
-        <w:spacing w:after="20"/>
+        <w:spacing w:after="40"/>
       </w:pPr>
       <w:r>
         <w:rPr>
@@ -450,7 +450,7 @@
     </w:p>
     <w:p>
       <w:pPr>
-        <w:spacing w:after="20"/>
+        <w:spacing w:after="40"/>
       </w:pPr>
       <w:r>
         <w:rPr>
@@ -469,7 +469,7 @@
     </w:p>
     <w:p>
       <w:pPr>
-        <w:spacing w:after="20"/>
+        <w:spacing w:after="40"/>
       </w:pPr>
       <w:r>
         <w:rPr>
@@ -488,7 +488,7 @@
     </w:p>
     <w:p>
       <w:pPr>
-        <w:spacing w:after="20"/>
+        <w:spacing w:after="40"/>
       </w:pPr>
       <w:r>
         <w:rPr>
@@ -507,7 +507,7 @@
     </w:p>
     <w:p>
       <w:pPr>
-        <w:spacing w:after="20"/>
+        <w:spacing w:after="40"/>
       </w:pPr>
       <w:r>
         <w:rPr>
@@ -526,7 +526,7 @@
     </w:p>
     <w:p>
       <w:pPr>
-        <w:spacing w:after="20"/>
+        <w:spacing w:after="40"/>
       </w:pPr>
       <w:r>
         <w:rPr>
@@ -580,7 +580,7 @@
         <w:tabs>
           <w:tab w:pos="360" w:val="left"/>
         </w:tabs>
-        <w:spacing w:after="40"/>
+        <w:spacing w:line="240" w:lineRule="auto" w:after="60"/>
         <w:ind w:left="360" w:hanging="360"/>
       </w:pPr>
       <w:r>
@@ -642,7 +642,7 @@
         <w:tabs>
           <w:tab w:pos="360" w:val="left"/>
         </w:tabs>
-        <w:spacing w:after="40"/>
+        <w:spacing w:line="240" w:lineRule="auto" w:after="60"/>
         <w:ind w:left="360" w:hanging="360"/>
       </w:pPr>
       <w:r>
@@ -732,7 +732,7 @@
         <w:tabs>
           <w:tab w:pos="360" w:val="left"/>
         </w:tabs>
-        <w:spacing w:after="40"/>
+        <w:spacing w:line="240" w:lineRule="auto" w:after="60"/>
         <w:ind w:left="360" w:hanging="360"/>
       </w:pPr>
       <w:r>
@@ -822,7 +822,7 @@
         <w:tabs>
           <w:tab w:pos="360" w:val="left"/>
         </w:tabs>
-        <w:spacing w:after="40"/>
+        <w:spacing w:line="240" w:lineRule="auto" w:after="60"/>
         <w:ind w:left="360" w:hanging="360"/>
       </w:pPr>
       <w:r>
@@ -898,7 +898,7 @@
         <w:tabs>
           <w:tab w:pos="360" w:val="left"/>
         </w:tabs>
-        <w:spacing w:after="40"/>
+        <w:spacing w:line="240" w:lineRule="auto" w:after="60"/>
         <w:ind w:left="360" w:hanging="360"/>
       </w:pPr>
       <w:r>
@@ -974,7 +974,7 @@
         <w:tabs>
           <w:tab w:pos="360" w:val="left"/>
         </w:tabs>
-        <w:spacing w:after="40"/>
+        <w:spacing w:line="240" w:lineRule="auto" w:after="60"/>
         <w:ind w:left="360" w:hanging="360"/>
       </w:pPr>
       <w:r>
@@ -1036,7 +1036,7 @@
         <w:tabs>
           <w:tab w:pos="360" w:val="left"/>
         </w:tabs>
-        <w:spacing w:after="40"/>
+        <w:spacing w:line="240" w:lineRule="auto" w:after="60"/>
         <w:ind w:left="360" w:hanging="360"/>
       </w:pPr>
       <w:r>
@@ -1129,7 +1129,7 @@
         <w:tabs>
           <w:tab w:pos="360" w:val="left"/>
         </w:tabs>
-        <w:spacing w:after="40"/>
+        <w:spacing w:line="240" w:lineRule="auto" w:after="60"/>
         <w:ind w:left="360" w:hanging="360"/>
       </w:pPr>
       <w:r>
@@ -1219,7 +1219,7 @@
         <w:tabs>
           <w:tab w:pos="360" w:val="left"/>
         </w:tabs>
-        <w:spacing w:after="40"/>
+        <w:spacing w:line="240" w:lineRule="auto" w:after="60"/>
         <w:ind w:left="360" w:hanging="360"/>
       </w:pPr>
       <w:r>
@@ -1295,7 +1295,7 @@
         <w:tabs>
           <w:tab w:pos="360" w:val="left"/>
         </w:tabs>
-        <w:spacing w:after="40"/>
+        <w:spacing w:line="240" w:lineRule="auto" w:after="60"/>
         <w:ind w:left="360" w:hanging="360"/>
       </w:pPr>
       <w:r>
@@ -1385,7 +1385,7 @@
         <w:tabs>
           <w:tab w:pos="360" w:val="left"/>
         </w:tabs>
-        <w:spacing w:after="40"/>
+        <w:spacing w:line="240" w:lineRule="auto" w:after="60"/>
         <w:ind w:left="360" w:hanging="360"/>
       </w:pPr>
       <w:r>
@@ -1433,7 +1433,7 @@
         <w:tabs>
           <w:tab w:pos="360" w:val="left"/>
         </w:tabs>
-        <w:spacing w:after="40"/>
+        <w:spacing w:line="240" w:lineRule="auto" w:after="60"/>
         <w:ind w:left="360" w:hanging="360"/>
       </w:pPr>
       <w:r>
@@ -1554,7 +1554,7 @@
         <w:tabs>
           <w:tab w:pos="360" w:val="left"/>
         </w:tabs>
-        <w:spacing w:after="40"/>
+        <w:spacing w:line="240" w:lineRule="auto" w:after="60"/>
         <w:ind w:left="360" w:hanging="360"/>
       </w:pPr>
       <w:r>
@@ -1644,7 +1644,7 @@
         <w:tabs>
           <w:tab w:pos="360" w:val="left"/>
         </w:tabs>
-        <w:spacing w:after="40"/>
+        <w:spacing w:line="240" w:lineRule="auto" w:after="60"/>
         <w:ind w:left="360" w:hanging="360"/>
       </w:pPr>
       <w:r>
@@ -1734,7 +1734,7 @@
         <w:tabs>
           <w:tab w:pos="360" w:val="left"/>
         </w:tabs>
-        <w:spacing w:after="40"/>
+        <w:spacing w:line="240" w:lineRule="auto" w:after="60"/>
         <w:ind w:left="360" w:hanging="360"/>
       </w:pPr>
       <w:r>
@@ -1782,7 +1782,7 @@
         <w:tabs>
           <w:tab w:pos="360" w:val="left"/>
         </w:tabs>
-        <w:spacing w:after="40"/>
+        <w:spacing w:line="240" w:lineRule="auto" w:after="60"/>
         <w:ind w:left="360" w:hanging="360"/>
       </w:pPr>
       <w:r>
@@ -1858,7 +1858,7 @@
         <w:tabs>
           <w:tab w:pos="360" w:val="left"/>
         </w:tabs>
-        <w:spacing w:after="40"/>
+        <w:spacing w:line="240" w:lineRule="auto" w:after="60"/>
         <w:ind w:left="360" w:hanging="360"/>
       </w:pPr>
       <w:r>
@@ -1962,7 +1962,7 @@
         <w:tabs>
           <w:tab w:pos="360" w:val="left"/>
         </w:tabs>
-        <w:spacing w:after="40"/>
+        <w:spacing w:line="240" w:lineRule="auto" w:after="60"/>
         <w:ind w:left="360" w:hanging="360"/>
       </w:pPr>
       <w:r>
@@ -2083,7 +2083,7 @@
         <w:tabs>
           <w:tab w:pos="360" w:val="left"/>
         </w:tabs>
-        <w:spacing w:after="40"/>
+        <w:spacing w:line="240" w:lineRule="auto" w:after="60"/>
         <w:ind w:left="360" w:hanging="360"/>
       </w:pPr>
       <w:r>
@@ -2173,7 +2173,7 @@
         <w:tabs>
           <w:tab w:pos="360" w:val="left"/>
         </w:tabs>
-        <w:spacing w:after="40"/>
+        <w:spacing w:line="240" w:lineRule="auto" w:after="60"/>
         <w:ind w:left="360" w:hanging="360"/>
       </w:pPr>
       <w:r>
@@ -2235,7 +2235,7 @@
         <w:tabs>
           <w:tab w:pos="360" w:val="left"/>
         </w:tabs>
-        <w:spacing w:after="40"/>
+        <w:spacing w:line="240" w:lineRule="auto" w:after="60"/>
         <w:ind w:left="360" w:hanging="360"/>
       </w:pPr>
       <w:r>
@@ -2311,7 +2311,7 @@
         <w:tabs>
           <w:tab w:pos="360" w:val="left"/>
         </w:tabs>
-        <w:spacing w:after="40"/>
+        <w:spacing w:line="240" w:lineRule="auto" w:after="60"/>
         <w:ind w:left="360" w:hanging="360"/>
       </w:pPr>
       <w:r>
@@ -2415,7 +2415,7 @@
         <w:tabs>
           <w:tab w:pos="360" w:val="left"/>
         </w:tabs>
-        <w:spacing w:after="40"/>
+        <w:spacing w:line="240" w:lineRule="auto" w:after="60"/>
         <w:ind w:left="360" w:hanging="360"/>
       </w:pPr>
       <w:r>
@@ -2489,40 +2489,46 @@
     </w:p>
     <w:p>
       <w:pPr>
-        <w:spacing w:after="40"/>
+        <w:spacing w:line="276" w:lineRule="auto"/>
       </w:pPr>
       <w:r>
         <w:rPr>
           <w:b/>
-          <w:sz w:val="22"/>
-        </w:rPr>
-        <w:t>Master’s in Data Analytics and Engineering</w:t>
-      </w:r>
-      <w:r>
-        <w:rPr>
-          <w:b w:val="0"/>
-          <w:sz w:val="22"/>
-        </w:rPr>
-        <w:t xml:space="preserve"> | George Mason University, Fairfax, VA, USA.</w:t>
+        </w:rPr>
+        <w:t>Master’s in Data Analytics and Engineering,</w:t>
       </w:r>
     </w:p>
     <w:p>
       <w:pPr>
-        <w:spacing w:after="40"/>
+        <w:spacing w:line="276" w:lineRule="auto"/>
       </w:pPr>
       <w:r>
         <w:rPr>
+          <w:b w:val="0"/>
+        </w:rPr>
+        <w:t>George Mason University - Fairfax, VA, USA.</w:t>
+      </w:r>
+    </w:p>
+    <w:p>
+      <w:pPr>
+        <w:spacing w:line="276" w:lineRule="auto"/>
+      </w:pPr>
+      <w:r>
+        <w:rPr>
           <w:b/>
-          <w:sz w:val="22"/>
-        </w:rPr>
-        <w:t>Bachelor’s in Information Science and Engineering</w:t>
-      </w:r>
+        </w:rPr>
+        <w:t>Bachelor’s in Information Science and Engineering,</w:t>
+      </w:r>
+    </w:p>
+    <w:p>
+      <w:pPr>
+        <w:spacing w:line="276" w:lineRule="auto"/>
+      </w:pPr>
       <w:r>
         <w:rPr>
           <w:b w:val="0"/>
-          <w:sz w:val="22"/>
-        </w:rPr>
-        <w:t xml:space="preserve"> | Visvesvaraya Technological University, Bengaluru, Karnataka, India.</w:t>
+        </w:rPr>
+        <w:t>Visvesvaraya Technological University - Bengaluru, Karnataka, India.</w:t>
       </w:r>
     </w:p>
     <w:sectPr>

</xml_diff>